<commit_message>
fix(onboarding): add missing Alert imports
</commit_message>
<xml_diff>
--- a/docs/Relatorio Status 5.docx
+++ b/docs/Relatorio Status 5.docx
@@ -310,7 +310,7 @@
                 <w:sz w:val="52"/>
                 <w:szCs w:val="52"/>
               </w:rPr>
-              <w:t xml:space="preserve">30</w:t>
+              <w:t xml:space="preserve">38</w:t>
             </w:r>
           </w:p>
           <w:p>
@@ -408,7 +408,7 @@
                 <w:sz w:val="52"/>
                 <w:szCs w:val="52"/>
               </w:rPr>
-              <w:t xml:space="preserve">18</w:t>
+              <w:t xml:space="preserve">11</w:t>
             </w:r>
           </w:p>
           <w:p>
@@ -661,8 +661,8 @@
         </w:tblBorders>
       </w:tblPr>
       <w:tblGrid>
+        <w:gridCol w:w="6014"/>
         <w:gridCol w:w="4010"/>
-        <w:gridCol w:w="6014"/>
       </w:tblGrid>
       <w:tr>
         <w:tc>
@@ -701,7 +701,7 @@
                 <w:sz w:val="20"/>
                 <w:szCs w:val="20"/>
               </w:rPr>
-              <w:t xml:space="preserve">  40%</w:t>
+              <w:t xml:space="preserve">  60%</w:t>
             </w:r>
           </w:p>
         </w:tc>
@@ -709,7 +709,7 @@
       <w:tr>
         <w:tc>
           <w:tcPr>
-            <w:tcW w:type="dxa" w:w="4010"/>
+            <w:tcW w:type="dxa" w:w="6014"/>
             <w:tcBorders>
               <w:top w:val="none" w:color="FFFFFF" w:sz="0"/>
               <w:left w:val="none" w:color="FFFFFF" w:sz="0"/>
@@ -736,7 +736,7 @@
         </w:tc>
         <w:tc>
           <w:tcPr>
-            <w:tcW w:type="dxa" w:w="6014"/>
+            <w:tcW w:type="dxa" w:w="4010"/>
             <w:tcBorders>
               <w:top w:val="none" w:color="FFFFFF" w:sz="0"/>
               <w:left w:val="none" w:color="FFFFFF" w:sz="0"/>
@@ -4860,6 +4860,384 @@
           </w:p>
         </w:tc>
       </w:tr>
+      <w:tr>
+        <w:tc>
+          <w:tcPr>
+            <w:tcW w:type="dxa" w:w="1400"/>
+            <w:tcBorders>
+              <w:top w:val="single" w:color="D1D5DB" w:sz="1"/>
+              <w:left w:val="single" w:color="D1D5DB" w:sz="1"/>
+              <w:bottom w:val="single" w:color="D1D5DB" w:sz="1"/>
+              <w:right w:val="single" w:color="D1D5DB" w:sz="1"/>
+            </w:tcBorders>
+            <w:shd w:fill="F9FAFB" w:val="clear"/>
+            <w:tcMar>
+              <w:top w:type="dxa" w:w="60"/>
+              <w:left w:type="dxa" w:w="100"/>
+              <w:bottom w:type="dxa" w:w="60"/>
+              <w:right w:type="dxa" w:w="100"/>
+            </w:tcMar>
+          </w:tcPr>
+          <w:p>
+            <w:pPr>
+              <w:jc w:val="center"/>
+            </w:pPr>
+            <w:r>
+              <w:rPr>
+                <w:rFonts w:ascii="Calibri" w:cs="Calibri" w:eastAsia="Calibri" w:hAnsi="Calibri"/>
+                <w:b/>
+                <w:bCs/>
+                <w:color w:val="16A34A"/>
+                <w:sz w:val="14"/>
+                <w:szCs w:val="14"/>
+              </w:rPr>
+              <w:t xml:space="preserve">CONCLUIDO</w:t>
+            </w:r>
+          </w:p>
+        </w:tc>
+        <w:tc>
+          <w:tcPr>
+            <w:tcW w:type="dxa" w:w="5200"/>
+            <w:tcBorders>
+              <w:top w:val="single" w:color="D1D5DB" w:sz="1"/>
+              <w:left w:val="single" w:color="D1D5DB" w:sz="1"/>
+              <w:bottom w:val="single" w:color="D1D5DB" w:sz="1"/>
+              <w:right w:val="single" w:color="D1D5DB" w:sz="1"/>
+            </w:tcBorders>
+            <w:shd w:fill="F9FAFB" w:val="clear"/>
+            <w:tcMar>
+              <w:top w:type="dxa" w:w="60"/>
+              <w:left w:type="dxa" w:w="100"/>
+              <w:bottom w:type="dxa" w:w="60"/>
+              <w:right w:type="dxa" w:w="100"/>
+            </w:tcMar>
+          </w:tcPr>
+          <w:p>
+            <w:r>
+              <w:rPr>
+                <w:rFonts w:ascii="Calibri" w:cs="Calibri" w:eastAsia="Calibri" w:hAnsi="Calibri"/>
+                <w:color w:val="111827"/>
+                <w:sz w:val="18"/>
+                <w:szCs w:val="18"/>
+              </w:rPr>
+              <w:t xml:space="preserve">Fix: salvar corretamente pricingStrategy e operationMode no perfil do usuario (backend) — dados de configuracao de IA persistidos via PATCH /profile (commit bf6f970)</w:t>
+            </w:r>
+          </w:p>
+        </w:tc>
+        <w:tc>
+          <w:tcPr>
+            <w:tcW w:type="dxa" w:w="1500"/>
+            <w:tcBorders>
+              <w:top w:val="single" w:color="D1D5DB" w:sz="1"/>
+              <w:left w:val="single" w:color="D1D5DB" w:sz="1"/>
+              <w:bottom w:val="single" w:color="D1D5DB" w:sz="1"/>
+              <w:right w:val="single" w:color="D1D5DB" w:sz="1"/>
+            </w:tcBorders>
+            <w:shd w:fill="F9FAFB" w:val="clear"/>
+            <w:tcMar>
+              <w:top w:type="dxa" w:w="60"/>
+              <w:left w:type="dxa" w:w="100"/>
+              <w:bottom w:type="dxa" w:w="60"/>
+              <w:right w:type="dxa" w:w="100"/>
+            </w:tcMar>
+          </w:tcPr>
+          <w:p>
+            <w:pPr>
+              <w:jc w:val="center"/>
+            </w:pPr>
+            <w:r>
+              <w:rPr>
+                <w:rFonts w:ascii="Calibri" w:cs="Calibri" w:eastAsia="Calibri" w:hAnsi="Calibri"/>
+                <w:color w:val="6B7280"/>
+                <w:sz w:val="17"/>
+                <w:szCs w:val="17"/>
+              </w:rPr>
+              <w:t xml:space="preserve">S3</w:t>
+            </w:r>
+          </w:p>
+        </w:tc>
+        <w:tc>
+          <w:tcPr>
+            <w:tcW w:type="dxa" w:w="2124"/>
+            <w:tcBorders>
+              <w:top w:val="single" w:color="D1D5DB" w:sz="1"/>
+              <w:left w:val="single" w:color="D1D5DB" w:sz="1"/>
+              <w:bottom w:val="single" w:color="D1D5DB" w:sz="1"/>
+              <w:right w:val="single" w:color="D1D5DB" w:sz="1"/>
+            </w:tcBorders>
+            <w:shd w:fill="F9FAFB" w:val="clear"/>
+            <w:tcMar>
+              <w:top w:type="dxa" w:w="60"/>
+              <w:left w:type="dxa" w:w="100"/>
+              <w:bottom w:type="dxa" w:w="60"/>
+              <w:right w:type="dxa" w:w="100"/>
+            </w:tcMar>
+          </w:tcPr>
+          <w:p>
+            <w:r>
+              <w:rPr>
+                <w:rFonts w:ascii="Calibri" w:cs="Calibri" w:eastAsia="Calibri" w:hAnsi="Calibri"/>
+                <w:color w:val="6B7280"/>
+                <w:sz w:val="17"/>
+                <w:szCs w:val="17"/>
+              </w:rPr>
+              <w:t xml:space="preserve">Gustavo/Dev</w:t>
+            </w:r>
+          </w:p>
+        </w:tc>
+      </w:tr>
+      <w:tr>
+        <w:tc>
+          <w:tcPr>
+            <w:tcW w:type="dxa" w:w="1400"/>
+            <w:tcBorders>
+              <w:top w:val="single" w:color="D1D5DB" w:sz="1"/>
+              <w:left w:val="single" w:color="D1D5DB" w:sz="1"/>
+              <w:bottom w:val="single" w:color="D1D5DB" w:sz="1"/>
+              <w:right w:val="single" w:color="D1D5DB" w:sz="1"/>
+            </w:tcBorders>
+            <w:shd w:fill="FFFFFF" w:val="clear"/>
+            <w:tcMar>
+              <w:top w:type="dxa" w:w="60"/>
+              <w:left w:type="dxa" w:w="100"/>
+              <w:bottom w:type="dxa" w:w="60"/>
+              <w:right w:type="dxa" w:w="100"/>
+            </w:tcMar>
+          </w:tcPr>
+          <w:p>
+            <w:pPr>
+              <w:jc w:val="center"/>
+            </w:pPr>
+            <w:r>
+              <w:rPr>
+                <w:rFonts w:ascii="Calibri" w:cs="Calibri" w:eastAsia="Calibri" w:hAnsi="Calibri"/>
+                <w:b/>
+                <w:bCs/>
+                <w:color w:val="16A34A"/>
+                <w:sz w:val="14"/>
+                <w:szCs w:val="14"/>
+              </w:rPr>
+              <w:t xml:space="preserve">CONCLUIDO</w:t>
+            </w:r>
+          </w:p>
+        </w:tc>
+        <w:tc>
+          <w:tcPr>
+            <w:tcW w:type="dxa" w:w="5200"/>
+            <w:tcBorders>
+              <w:top w:val="single" w:color="D1D5DB" w:sz="1"/>
+              <w:left w:val="single" w:color="D1D5DB" w:sz="1"/>
+              <w:bottom w:val="single" w:color="D1D5DB" w:sz="1"/>
+              <w:right w:val="single" w:color="D1D5DB" w:sz="1"/>
+            </w:tcBorders>
+            <w:shd w:fill="FFFFFF" w:val="clear"/>
+            <w:tcMar>
+              <w:top w:type="dxa" w:w="60"/>
+              <w:left w:type="dxa" w:w="100"/>
+              <w:bottom w:type="dxa" w:w="60"/>
+              <w:right w:type="dxa" w:w="100"/>
+            </w:tcMar>
+          </w:tcPr>
+          <w:p>
+            <w:r>
+              <w:rPr>
+                <w:rFonts w:ascii="Calibri" w:cs="Calibri" w:eastAsia="Calibri" w:hAnsi="Calibri"/>
+                <w:color w:val="111827"/>
+                <w:sz w:val="18"/>
+                <w:szCs w:val="18"/>
+              </w:rPr>
+              <w:t xml:space="preserve">Fix 404: limites percentuais (percentualBounds) persistidos via atualizacao de perfil — rota correta mapeada (commit 5c65b46)</w:t>
+            </w:r>
+          </w:p>
+        </w:tc>
+        <w:tc>
+          <w:tcPr>
+            <w:tcW w:type="dxa" w:w="1500"/>
+            <w:tcBorders>
+              <w:top w:val="single" w:color="D1D5DB" w:sz="1"/>
+              <w:left w:val="single" w:color="D1D5DB" w:sz="1"/>
+              <w:bottom w:val="single" w:color="D1D5DB" w:sz="1"/>
+              <w:right w:val="single" w:color="D1D5DB" w:sz="1"/>
+            </w:tcBorders>
+            <w:shd w:fill="FFFFFF" w:val="clear"/>
+            <w:tcMar>
+              <w:top w:type="dxa" w:w="60"/>
+              <w:left w:type="dxa" w:w="100"/>
+              <w:bottom w:type="dxa" w:w="60"/>
+              <w:right w:type="dxa" w:w="100"/>
+            </w:tcMar>
+          </w:tcPr>
+          <w:p>
+            <w:pPr>
+              <w:jc w:val="center"/>
+            </w:pPr>
+            <w:r>
+              <w:rPr>
+                <w:rFonts w:ascii="Calibri" w:cs="Calibri" w:eastAsia="Calibri" w:hAnsi="Calibri"/>
+                <w:color w:val="6B7280"/>
+                <w:sz w:val="17"/>
+                <w:szCs w:val="17"/>
+              </w:rPr>
+              <w:t xml:space="preserve">S3</w:t>
+            </w:r>
+          </w:p>
+        </w:tc>
+        <w:tc>
+          <w:tcPr>
+            <w:tcW w:type="dxa" w:w="2124"/>
+            <w:tcBorders>
+              <w:top w:val="single" w:color="D1D5DB" w:sz="1"/>
+              <w:left w:val="single" w:color="D1D5DB" w:sz="1"/>
+              <w:bottom w:val="single" w:color="D1D5DB" w:sz="1"/>
+              <w:right w:val="single" w:color="D1D5DB" w:sz="1"/>
+            </w:tcBorders>
+            <w:shd w:fill="FFFFFF" w:val="clear"/>
+            <w:tcMar>
+              <w:top w:type="dxa" w:w="60"/>
+              <w:left w:type="dxa" w:w="100"/>
+              <w:bottom w:type="dxa" w:w="60"/>
+              <w:right w:type="dxa" w:w="100"/>
+            </w:tcMar>
+          </w:tcPr>
+          <w:p>
+            <w:r>
+              <w:rPr>
+                <w:rFonts w:ascii="Calibri" w:cs="Calibri" w:eastAsia="Calibri" w:hAnsi="Calibri"/>
+                <w:color w:val="6B7280"/>
+                <w:sz w:val="17"/>
+                <w:szCs w:val="17"/>
+              </w:rPr>
+              <w:t xml:space="preserve">Gustavo/Dev</w:t>
+            </w:r>
+          </w:p>
+        </w:tc>
+      </w:tr>
+      <w:tr>
+        <w:tc>
+          <w:tcPr>
+            <w:tcW w:type="dxa" w:w="1400"/>
+            <w:tcBorders>
+              <w:top w:val="single" w:color="D1D5DB" w:sz="1"/>
+              <w:left w:val="single" w:color="D1D5DB" w:sz="1"/>
+              <w:bottom w:val="single" w:color="D1D5DB" w:sz="1"/>
+              <w:right w:val="single" w:color="D1D5DB" w:sz="1"/>
+            </w:tcBorders>
+            <w:shd w:fill="F9FAFB" w:val="clear"/>
+            <w:tcMar>
+              <w:top w:type="dxa" w:w="60"/>
+              <w:left w:type="dxa" w:w="100"/>
+              <w:bottom w:type="dxa" w:w="60"/>
+              <w:right w:type="dxa" w:w="100"/>
+            </w:tcMar>
+          </w:tcPr>
+          <w:p>
+            <w:pPr>
+              <w:jc w:val="center"/>
+            </w:pPr>
+            <w:r>
+              <w:rPr>
+                <w:rFonts w:ascii="Calibri" w:cs="Calibri" w:eastAsia="Calibri" w:hAnsi="Calibri"/>
+                <w:b/>
+                <w:bCs/>
+                <w:color w:val="16A34A"/>
+                <w:sz w:val="14"/>
+                <w:szCs w:val="14"/>
+              </w:rPr>
+              <w:t xml:space="preserve">CONCLUIDO</w:t>
+            </w:r>
+          </w:p>
+        </w:tc>
+        <w:tc>
+          <w:tcPr>
+            <w:tcW w:type="dxa" w:w="5200"/>
+            <w:tcBorders>
+              <w:top w:val="single" w:color="D1D5DB" w:sz="1"/>
+              <w:left w:val="single" w:color="D1D5DB" w:sz="1"/>
+              <w:bottom w:val="single" w:color="D1D5DB" w:sz="1"/>
+              <w:right w:val="single" w:color="D1D5DB" w:sz="1"/>
+            </w:tcBorders>
+            <w:shd w:fill="F9FAFB" w:val="clear"/>
+            <w:tcMar>
+              <w:top w:type="dxa" w:w="60"/>
+              <w:left w:type="dxa" w:w="100"/>
+              <w:bottom w:type="dxa" w:w="60"/>
+              <w:right w:type="dxa" w:w="100"/>
+            </w:tcMar>
+          </w:tcPr>
+          <w:p>
+            <w:r>
+              <w:rPr>
+                <w:rFonts w:ascii="Calibri" w:cs="Calibri" w:eastAsia="Calibri" w:hAnsi="Calibri"/>
+                <w:color w:val="111827"/>
+                <w:sz w:val="18"/>
+                <w:szCs w:val="18"/>
+              </w:rPr>
+              <w:t xml:space="preserve">Botao de avanco quando todos imoveis ja cadastrados no onboarding + criacao da rota /lancamento/page.tsx (commit 3107496)</w:t>
+            </w:r>
+          </w:p>
+        </w:tc>
+        <w:tc>
+          <w:tcPr>
+            <w:tcW w:type="dxa" w:w="1500"/>
+            <w:tcBorders>
+              <w:top w:val="single" w:color="D1D5DB" w:sz="1"/>
+              <w:left w:val="single" w:color="D1D5DB" w:sz="1"/>
+              <w:bottom w:val="single" w:color="D1D5DB" w:sz="1"/>
+              <w:right w:val="single" w:color="D1D5DB" w:sz="1"/>
+            </w:tcBorders>
+            <w:shd w:fill="F9FAFB" w:val="clear"/>
+            <w:tcMar>
+              <w:top w:type="dxa" w:w="60"/>
+              <w:left w:type="dxa" w:w="100"/>
+              <w:bottom w:type="dxa" w:w="60"/>
+              <w:right w:type="dxa" w:w="100"/>
+            </w:tcMar>
+          </w:tcPr>
+          <w:p>
+            <w:pPr>
+              <w:jc w:val="center"/>
+            </w:pPr>
+            <w:r>
+              <w:rPr>
+                <w:rFonts w:ascii="Calibri" w:cs="Calibri" w:eastAsia="Calibri" w:hAnsi="Calibri"/>
+                <w:color w:val="6B7280"/>
+                <w:sz w:val="17"/>
+                <w:szCs w:val="17"/>
+              </w:rPr>
+              <w:t xml:space="preserve">S3</w:t>
+            </w:r>
+          </w:p>
+        </w:tc>
+        <w:tc>
+          <w:tcPr>
+            <w:tcW w:type="dxa" w:w="2124"/>
+            <w:tcBorders>
+              <w:top w:val="single" w:color="D1D5DB" w:sz="1"/>
+              <w:left w:val="single" w:color="D1D5DB" w:sz="1"/>
+              <w:bottom w:val="single" w:color="D1D5DB" w:sz="1"/>
+              <w:right w:val="single" w:color="D1D5DB" w:sz="1"/>
+            </w:tcBorders>
+            <w:shd w:fill="F9FAFB" w:val="clear"/>
+            <w:tcMar>
+              <w:top w:type="dxa" w:w="60"/>
+              <w:left w:type="dxa" w:w="100"/>
+              <w:bottom w:type="dxa" w:w="60"/>
+              <w:right w:type="dxa" w:w="100"/>
+            </w:tcMar>
+          </w:tcPr>
+          <w:p>
+            <w:r>
+              <w:rPr>
+                <w:rFonts w:ascii="Calibri" w:cs="Calibri" w:eastAsia="Calibri" w:hAnsi="Calibri"/>
+                <w:color w:val="6B7280"/>
+                <w:sz w:val="17"/>
+                <w:szCs w:val="17"/>
+              </w:rPr>
+              <w:t xml:space="preserve">Gustavo/Dev</w:t>
+            </w:r>
+          </w:p>
+        </w:tc>
+      </w:tr>
     </w:tbl>
     <w:p>
       <w:pPr>
@@ -7360,6 +7738,384 @@
           </w:p>
         </w:tc>
       </w:tr>
+      <w:tr>
+        <w:tc>
+          <w:tcPr>
+            <w:tcW w:type="dxa" w:w="1400"/>
+            <w:tcBorders>
+              <w:top w:val="single" w:color="D1D5DB" w:sz="1"/>
+              <w:left w:val="single" w:color="D1D5DB" w:sz="1"/>
+              <w:bottom w:val="single" w:color="D1D5DB" w:sz="1"/>
+              <w:right w:val="single" w:color="D1D5DB" w:sz="1"/>
+            </w:tcBorders>
+            <w:shd w:fill="F9FAFB" w:val="clear"/>
+            <w:tcMar>
+              <w:top w:type="dxa" w:w="60"/>
+              <w:left w:type="dxa" w:w="100"/>
+              <w:bottom w:type="dxa" w:w="60"/>
+              <w:right w:type="dxa" w:w="100"/>
+            </w:tcMar>
+          </w:tcPr>
+          <w:p>
+            <w:pPr>
+              <w:jc w:val="center"/>
+            </w:pPr>
+            <w:r>
+              <w:rPr>
+                <w:rFonts w:ascii="Calibri" w:cs="Calibri" w:eastAsia="Calibri" w:hAnsi="Calibri"/>
+                <w:b/>
+                <w:bCs/>
+                <w:color w:val="16A34A"/>
+                <w:sz w:val="14"/>
+                <w:szCs w:val="14"/>
+              </w:rPr>
+              <w:t xml:space="preserve">CONCLUIDO</w:t>
+            </w:r>
+          </w:p>
+        </w:tc>
+        <w:tc>
+          <w:tcPr>
+            <w:tcW w:type="dxa" w:w="5200"/>
+            <w:tcBorders>
+              <w:top w:val="single" w:color="D1D5DB" w:sz="1"/>
+              <w:left w:val="single" w:color="D1D5DB" w:sz="1"/>
+              <w:bottom w:val="single" w:color="D1D5DB" w:sz="1"/>
+              <w:right w:val="single" w:color="D1D5DB" w:sz="1"/>
+            </w:tcBorders>
+            <w:shd w:fill="F9FAFB" w:val="clear"/>
+            <w:tcMar>
+              <w:top w:type="dxa" w:w="60"/>
+              <w:left w:type="dxa" w:w="100"/>
+              <w:bottom w:type="dxa" w:w="60"/>
+              <w:right w:type="dxa" w:w="100"/>
+            </w:tcMar>
+          </w:tcPr>
+          <w:p>
+            <w:r>
+              <w:rPr>
+                <w:rFonts w:ascii="Calibri" w:cs="Calibri" w:eastAsia="Calibri" w:hAnsi="Calibri"/>
+                <w:color w:val="111827"/>
+                <w:sz w:val="18"/>
+                <w:szCs w:val="18"/>
+              </w:rPr>
+              <w:t xml:space="preserve">Campos de configuracao do motor de IA adicionados na pagina de configuracoes/event-log — operationMode, pricingStrategy, percentualBounds visiveis pelo usuario (commit 0db7456)</w:t>
+            </w:r>
+          </w:p>
+        </w:tc>
+        <w:tc>
+          <w:tcPr>
+            <w:tcW w:type="dxa" w:w="1500"/>
+            <w:tcBorders>
+              <w:top w:val="single" w:color="D1D5DB" w:sz="1"/>
+              <w:left w:val="single" w:color="D1D5DB" w:sz="1"/>
+              <w:bottom w:val="single" w:color="D1D5DB" w:sz="1"/>
+              <w:right w:val="single" w:color="D1D5DB" w:sz="1"/>
+            </w:tcBorders>
+            <w:shd w:fill="F9FAFB" w:val="clear"/>
+            <w:tcMar>
+              <w:top w:type="dxa" w:w="60"/>
+              <w:left w:type="dxa" w:w="100"/>
+              <w:bottom w:type="dxa" w:w="60"/>
+              <w:right w:type="dxa" w:w="100"/>
+            </w:tcMar>
+          </w:tcPr>
+          <w:p>
+            <w:pPr>
+              <w:jc w:val="center"/>
+            </w:pPr>
+            <w:r>
+              <w:rPr>
+                <w:rFonts w:ascii="Calibri" w:cs="Calibri" w:eastAsia="Calibri" w:hAnsi="Calibri"/>
+                <w:color w:val="6B7280"/>
+                <w:sz w:val="17"/>
+                <w:szCs w:val="17"/>
+              </w:rPr>
+              <w:t xml:space="preserve">S3</w:t>
+            </w:r>
+          </w:p>
+        </w:tc>
+        <w:tc>
+          <w:tcPr>
+            <w:tcW w:type="dxa" w:w="2124"/>
+            <w:tcBorders>
+              <w:top w:val="single" w:color="D1D5DB" w:sz="1"/>
+              <w:left w:val="single" w:color="D1D5DB" w:sz="1"/>
+              <w:bottom w:val="single" w:color="D1D5DB" w:sz="1"/>
+              <w:right w:val="single" w:color="D1D5DB" w:sz="1"/>
+            </w:tcBorders>
+            <w:shd w:fill="F9FAFB" w:val="clear"/>
+            <w:tcMar>
+              <w:top w:type="dxa" w:w="60"/>
+              <w:left w:type="dxa" w:w="100"/>
+              <w:bottom w:type="dxa" w:w="60"/>
+              <w:right w:type="dxa" w:w="100"/>
+            </w:tcMar>
+          </w:tcPr>
+          <w:p>
+            <w:r>
+              <w:rPr>
+                <w:rFonts w:ascii="Calibri" w:cs="Calibri" w:eastAsia="Calibri" w:hAnsi="Calibri"/>
+                <w:color w:val="6B7280"/>
+                <w:sz w:val="17"/>
+                <w:szCs w:val="17"/>
+              </w:rPr>
+              <w:t xml:space="preserve">Gustavo/Dev</w:t>
+            </w:r>
+          </w:p>
+        </w:tc>
+      </w:tr>
+      <w:tr>
+        <w:tc>
+          <w:tcPr>
+            <w:tcW w:type="dxa" w:w="1400"/>
+            <w:tcBorders>
+              <w:top w:val="single" w:color="D1D5DB" w:sz="1"/>
+              <w:left w:val="single" w:color="D1D5DB" w:sz="1"/>
+              <w:bottom w:val="single" w:color="D1D5DB" w:sz="1"/>
+              <w:right w:val="single" w:color="D1D5DB" w:sz="1"/>
+            </w:tcBorders>
+            <w:shd w:fill="FFFFFF" w:val="clear"/>
+            <w:tcMar>
+              <w:top w:type="dxa" w:w="60"/>
+              <w:left w:type="dxa" w:w="100"/>
+              <w:bottom w:type="dxa" w:w="60"/>
+              <w:right w:type="dxa" w:w="100"/>
+            </w:tcMar>
+          </w:tcPr>
+          <w:p>
+            <w:pPr>
+              <w:jc w:val="center"/>
+            </w:pPr>
+            <w:r>
+              <w:rPr>
+                <w:rFonts w:ascii="Calibri" w:cs="Calibri" w:eastAsia="Calibri" w:hAnsi="Calibri"/>
+                <w:b/>
+                <w:bCs/>
+                <w:color w:val="16A34A"/>
+                <w:sz w:val="14"/>
+                <w:szCs w:val="14"/>
+              </w:rPr>
+              <w:t xml:space="preserve">CONCLUIDO</w:t>
+            </w:r>
+          </w:p>
+        </w:tc>
+        <w:tc>
+          <w:tcPr>
+            <w:tcW w:type="dxa" w:w="5200"/>
+            <w:tcBorders>
+              <w:top w:val="single" w:color="D1D5DB" w:sz="1"/>
+              <w:left w:val="single" w:color="D1D5DB" w:sz="1"/>
+              <w:bottom w:val="single" w:color="D1D5DB" w:sz="1"/>
+              <w:right w:val="single" w:color="D1D5DB" w:sz="1"/>
+            </w:tcBorders>
+            <w:shd w:fill="FFFFFF" w:val="clear"/>
+            <w:tcMar>
+              <w:top w:type="dxa" w:w="60"/>
+              <w:left w:type="dxa" w:w="100"/>
+              <w:bottom w:type="dxa" w:w="60"/>
+              <w:right w:type="dxa" w:w="100"/>
+            </w:tcMar>
+          </w:tcPr>
+          <w:p>
+            <w:r>
+              <w:rPr>
+                <w:rFonts w:ascii="Calibri" w:cs="Calibri" w:eastAsia="Calibri" w:hAnsi="Calibri"/>
+                <w:color w:val="111827"/>
+                <w:sz w:val="18"/>
+                <w:szCs w:val="18"/>
+              </w:rPr>
+              <w:t xml:space="preserve">Fix TypeScript: valor nulo aceito no campo de ajuste percentual final da estrategia autonoma — previne erro de tipagem (commit 30707b7)</w:t>
+            </w:r>
+          </w:p>
+        </w:tc>
+        <w:tc>
+          <w:tcPr>
+            <w:tcW w:type="dxa" w:w="1500"/>
+            <w:tcBorders>
+              <w:top w:val="single" w:color="D1D5DB" w:sz="1"/>
+              <w:left w:val="single" w:color="D1D5DB" w:sz="1"/>
+              <w:bottom w:val="single" w:color="D1D5DB" w:sz="1"/>
+              <w:right w:val="single" w:color="D1D5DB" w:sz="1"/>
+            </w:tcBorders>
+            <w:shd w:fill="FFFFFF" w:val="clear"/>
+            <w:tcMar>
+              <w:top w:type="dxa" w:w="60"/>
+              <w:left w:type="dxa" w:w="100"/>
+              <w:bottom w:type="dxa" w:w="60"/>
+              <w:right w:type="dxa" w:w="100"/>
+            </w:tcMar>
+          </w:tcPr>
+          <w:p>
+            <w:pPr>
+              <w:jc w:val="center"/>
+            </w:pPr>
+            <w:r>
+              <w:rPr>
+                <w:rFonts w:ascii="Calibri" w:cs="Calibri" w:eastAsia="Calibri" w:hAnsi="Calibri"/>
+                <w:color w:val="6B7280"/>
+                <w:sz w:val="17"/>
+                <w:szCs w:val="17"/>
+              </w:rPr>
+              <w:t xml:space="preserve">S3</w:t>
+            </w:r>
+          </w:p>
+        </w:tc>
+        <w:tc>
+          <w:tcPr>
+            <w:tcW w:type="dxa" w:w="2124"/>
+            <w:tcBorders>
+              <w:top w:val="single" w:color="D1D5DB" w:sz="1"/>
+              <w:left w:val="single" w:color="D1D5DB" w:sz="1"/>
+              <w:bottom w:val="single" w:color="D1D5DB" w:sz="1"/>
+              <w:right w:val="single" w:color="D1D5DB" w:sz="1"/>
+            </w:tcBorders>
+            <w:shd w:fill="FFFFFF" w:val="clear"/>
+            <w:tcMar>
+              <w:top w:type="dxa" w:w="60"/>
+              <w:left w:type="dxa" w:w="100"/>
+              <w:bottom w:type="dxa" w:w="60"/>
+              <w:right w:type="dxa" w:w="100"/>
+            </w:tcMar>
+          </w:tcPr>
+          <w:p>
+            <w:r>
+              <w:rPr>
+                <w:rFonts w:ascii="Calibri" w:cs="Calibri" w:eastAsia="Calibri" w:hAnsi="Calibri"/>
+                <w:color w:val="6B7280"/>
+                <w:sz w:val="17"/>
+                <w:szCs w:val="17"/>
+              </w:rPr>
+              <w:t xml:space="preserve">Gustavo/Dev</w:t>
+            </w:r>
+          </w:p>
+        </w:tc>
+      </w:tr>
+      <w:tr>
+        <w:tc>
+          <w:tcPr>
+            <w:tcW w:type="dxa" w:w="1400"/>
+            <w:tcBorders>
+              <w:top w:val="single" w:color="D1D5DB" w:sz="1"/>
+              <w:left w:val="single" w:color="D1D5DB" w:sz="1"/>
+              <w:bottom w:val="single" w:color="D1D5DB" w:sz="1"/>
+              <w:right w:val="single" w:color="D1D5DB" w:sz="1"/>
+            </w:tcBorders>
+            <w:shd w:fill="F9FAFB" w:val="clear"/>
+            <w:tcMar>
+              <w:top w:type="dxa" w:w="60"/>
+              <w:left w:type="dxa" w:w="100"/>
+              <w:bottom w:type="dxa" w:w="60"/>
+              <w:right w:type="dxa" w:w="100"/>
+            </w:tcMar>
+          </w:tcPr>
+          <w:p>
+            <w:pPr>
+              <w:jc w:val="center"/>
+            </w:pPr>
+            <w:r>
+              <w:rPr>
+                <w:rFonts w:ascii="Calibri" w:cs="Calibri" w:eastAsia="Calibri" w:hAnsi="Calibri"/>
+                <w:b/>
+                <w:bCs/>
+                <w:color w:val="16A34A"/>
+                <w:sz w:val="14"/>
+                <w:szCs w:val="14"/>
+              </w:rPr>
+              <w:t xml:space="preserve">CONCLUIDO</w:t>
+            </w:r>
+          </w:p>
+        </w:tc>
+        <w:tc>
+          <w:tcPr>
+            <w:tcW w:type="dxa" w:w="5200"/>
+            <w:tcBorders>
+              <w:top w:val="single" w:color="D1D5DB" w:sz="1"/>
+              <w:left w:val="single" w:color="D1D5DB" w:sz="1"/>
+              <w:bottom w:val="single" w:color="D1D5DB" w:sz="1"/>
+              <w:right w:val="single" w:color="D1D5DB" w:sz="1"/>
+            </w:tcBorders>
+            <w:shd w:fill="F9FAFB" w:val="clear"/>
+            <w:tcMar>
+              <w:top w:type="dxa" w:w="60"/>
+              <w:left w:type="dxa" w:w="100"/>
+              <w:bottom w:type="dxa" w:w="60"/>
+              <w:right w:type="dxa" w:w="100"/>
+            </w:tcMar>
+          </w:tcPr>
+          <w:p>
+            <w:r>
+              <w:rPr>
+                <w:rFonts w:ascii="Calibri" w:cs="Calibri" w:eastAsia="Calibri" w:hAnsi="Calibri"/>
+                <w:color w:val="111827"/>
+                <w:sz w:val="18"/>
+                <w:szCs w:val="18"/>
+              </w:rPr>
+              <w:t xml:space="preserve">Remover endpoints de percentual depreciados do event-log — limpeza de rotas obsoletas (commit 018ded5)</w:t>
+            </w:r>
+          </w:p>
+        </w:tc>
+        <w:tc>
+          <w:tcPr>
+            <w:tcW w:type="dxa" w:w="1500"/>
+            <w:tcBorders>
+              <w:top w:val="single" w:color="D1D5DB" w:sz="1"/>
+              <w:left w:val="single" w:color="D1D5DB" w:sz="1"/>
+              <w:bottom w:val="single" w:color="D1D5DB" w:sz="1"/>
+              <w:right w:val="single" w:color="D1D5DB" w:sz="1"/>
+            </w:tcBorders>
+            <w:shd w:fill="F9FAFB" w:val="clear"/>
+            <w:tcMar>
+              <w:top w:type="dxa" w:w="60"/>
+              <w:left w:type="dxa" w:w="100"/>
+              <w:bottom w:type="dxa" w:w="60"/>
+              <w:right w:type="dxa" w:w="100"/>
+            </w:tcMar>
+          </w:tcPr>
+          <w:p>
+            <w:pPr>
+              <w:jc w:val="center"/>
+            </w:pPr>
+            <w:r>
+              <w:rPr>
+                <w:rFonts w:ascii="Calibri" w:cs="Calibri" w:eastAsia="Calibri" w:hAnsi="Calibri"/>
+                <w:color w:val="6B7280"/>
+                <w:sz w:val="17"/>
+                <w:szCs w:val="17"/>
+              </w:rPr>
+              <w:t xml:space="preserve">S3</w:t>
+            </w:r>
+          </w:p>
+        </w:tc>
+        <w:tc>
+          <w:tcPr>
+            <w:tcW w:type="dxa" w:w="2124"/>
+            <w:tcBorders>
+              <w:top w:val="single" w:color="D1D5DB" w:sz="1"/>
+              <w:left w:val="single" w:color="D1D5DB" w:sz="1"/>
+              <w:bottom w:val="single" w:color="D1D5DB" w:sz="1"/>
+              <w:right w:val="single" w:color="D1D5DB" w:sz="1"/>
+            </w:tcBorders>
+            <w:shd w:fill="F9FAFB" w:val="clear"/>
+            <w:tcMar>
+              <w:top w:type="dxa" w:w="60"/>
+              <w:left w:type="dxa" w:w="100"/>
+              <w:bottom w:type="dxa" w:w="60"/>
+              <w:right w:type="dxa" w:w="100"/>
+            </w:tcMar>
+          </w:tcPr>
+          <w:p>
+            <w:r>
+              <w:rPr>
+                <w:rFonts w:ascii="Calibri" w:cs="Calibri" w:eastAsia="Calibri" w:hAnsi="Calibri"/>
+                <w:color w:val="6B7280"/>
+                <w:sz w:val="17"/>
+                <w:szCs w:val="17"/>
+              </w:rPr>
+              <w:t xml:space="preserve">Gustavo/Dev</w:t>
+            </w:r>
+          </w:p>
+        </w:tc>
+      </w:tr>
     </w:tbl>
     <w:p>
       <w:pPr>
@@ -8291,6 +9047,258 @@
                 <w:szCs w:val="17"/>
               </w:rPr>
               <w:t xml:space="preserve">Gustavo</w:t>
+            </w:r>
+          </w:p>
+        </w:tc>
+      </w:tr>
+      <w:tr>
+        <w:tc>
+          <w:tcPr>
+            <w:tcW w:type="dxa" w:w="1400"/>
+            <w:tcBorders>
+              <w:top w:val="single" w:color="D1D5DB" w:sz="1"/>
+              <w:left w:val="single" w:color="D1D5DB" w:sz="1"/>
+              <w:bottom w:val="single" w:color="D1D5DB" w:sz="1"/>
+              <w:right w:val="single" w:color="D1D5DB" w:sz="1"/>
+            </w:tcBorders>
+            <w:shd w:fill="FFFFFF" w:val="clear"/>
+            <w:tcMar>
+              <w:top w:type="dxa" w:w="60"/>
+              <w:left w:type="dxa" w:w="100"/>
+              <w:bottom w:type="dxa" w:w="60"/>
+              <w:right w:type="dxa" w:w="100"/>
+            </w:tcMar>
+          </w:tcPr>
+          <w:p>
+            <w:pPr>
+              <w:jc w:val="center"/>
+            </w:pPr>
+            <w:r>
+              <w:rPr>
+                <w:rFonts w:ascii="Calibri" w:cs="Calibri" w:eastAsia="Calibri" w:hAnsi="Calibri"/>
+                <w:b/>
+                <w:bCs/>
+                <w:color w:val="16A34A"/>
+                <w:sz w:val="14"/>
+                <w:szCs w:val="14"/>
+              </w:rPr>
+              <w:t xml:space="preserve">CONCLUIDO</w:t>
+            </w:r>
+          </w:p>
+        </w:tc>
+        <w:tc>
+          <w:tcPr>
+            <w:tcW w:type="dxa" w:w="5200"/>
+            <w:tcBorders>
+              <w:top w:val="single" w:color="D1D5DB" w:sz="1"/>
+              <w:left w:val="single" w:color="D1D5DB" w:sz="1"/>
+              <w:bottom w:val="single" w:color="D1D5DB" w:sz="1"/>
+              <w:right w:val="single" w:color="D1D5DB" w:sz="1"/>
+            </w:tcBorders>
+            <w:shd w:fill="FFFFFF" w:val="clear"/>
+            <w:tcMar>
+              <w:top w:type="dxa" w:w="60"/>
+              <w:left w:type="dxa" w:w="100"/>
+              <w:bottom w:type="dxa" w:w="60"/>
+              <w:right w:type="dxa" w:w="100"/>
+            </w:tcMar>
+          </w:tcPr>
+          <w:p>
+            <w:r>
+              <w:rPr>
+                <w:rFonts w:ascii="Calibri" w:cs="Calibri" w:eastAsia="Calibri" w:hAnsi="Calibri"/>
+                <w:color w:val="111827"/>
+                <w:sz w:val="18"/>
+                <w:szCs w:val="18"/>
+              </w:rPr>
+              <w:t xml:space="preserve">Planos migrados para entidades dinamicas no banco de dados — Plans entity no frontend e backend, fim de planos hardcoded (commit 48aeda8)</w:t>
+            </w:r>
+          </w:p>
+        </w:tc>
+        <w:tc>
+          <w:tcPr>
+            <w:tcW w:type="dxa" w:w="1500"/>
+            <w:tcBorders>
+              <w:top w:val="single" w:color="D1D5DB" w:sz="1"/>
+              <w:left w:val="single" w:color="D1D5DB" w:sz="1"/>
+              <w:bottom w:val="single" w:color="D1D5DB" w:sz="1"/>
+              <w:right w:val="single" w:color="D1D5DB" w:sz="1"/>
+            </w:tcBorders>
+            <w:shd w:fill="FFFFFF" w:val="clear"/>
+            <w:tcMar>
+              <w:top w:type="dxa" w:w="60"/>
+              <w:left w:type="dxa" w:w="100"/>
+              <w:bottom w:type="dxa" w:w="60"/>
+              <w:right w:type="dxa" w:w="100"/>
+            </w:tcMar>
+          </w:tcPr>
+          <w:p>
+            <w:pPr>
+              <w:jc w:val="center"/>
+            </w:pPr>
+            <w:r>
+              <w:rPr>
+                <w:rFonts w:ascii="Calibri" w:cs="Calibri" w:eastAsia="Calibri" w:hAnsi="Calibri"/>
+                <w:color w:val="6B7280"/>
+                <w:sz w:val="17"/>
+                <w:szCs w:val="17"/>
+              </w:rPr>
+              <w:t xml:space="preserve">S3</w:t>
+            </w:r>
+          </w:p>
+        </w:tc>
+        <w:tc>
+          <w:tcPr>
+            <w:tcW w:type="dxa" w:w="2124"/>
+            <w:tcBorders>
+              <w:top w:val="single" w:color="D1D5DB" w:sz="1"/>
+              <w:left w:val="single" w:color="D1D5DB" w:sz="1"/>
+              <w:bottom w:val="single" w:color="D1D5DB" w:sz="1"/>
+              <w:right w:val="single" w:color="D1D5DB" w:sz="1"/>
+            </w:tcBorders>
+            <w:shd w:fill="FFFFFF" w:val="clear"/>
+            <w:tcMar>
+              <w:top w:type="dxa" w:w="60"/>
+              <w:left w:type="dxa" w:w="100"/>
+              <w:bottom w:type="dxa" w:w="60"/>
+              <w:right w:type="dxa" w:w="100"/>
+            </w:tcMar>
+          </w:tcPr>
+          <w:p>
+            <w:r>
+              <w:rPr>
+                <w:rFonts w:ascii="Calibri" w:cs="Calibri" w:eastAsia="Calibri" w:hAnsi="Calibri"/>
+                <w:color w:val="6B7280"/>
+                <w:sz w:val="17"/>
+                <w:szCs w:val="17"/>
+              </w:rPr>
+              <w:t xml:space="preserve">Gustavo/Dev</w:t>
+            </w:r>
+          </w:p>
+        </w:tc>
+      </w:tr>
+      <w:tr>
+        <w:tc>
+          <w:tcPr>
+            <w:tcW w:type="dxa" w:w="1400"/>
+            <w:tcBorders>
+              <w:top w:val="single" w:color="D1D5DB" w:sz="1"/>
+              <w:left w:val="single" w:color="D1D5DB" w:sz="1"/>
+              <w:bottom w:val="single" w:color="D1D5DB" w:sz="1"/>
+              <w:right w:val="single" w:color="D1D5DB" w:sz="1"/>
+            </w:tcBorders>
+            <w:shd w:fill="F9FAFB" w:val="clear"/>
+            <w:tcMar>
+              <w:top w:type="dxa" w:w="60"/>
+              <w:left w:type="dxa" w:w="100"/>
+              <w:bottom w:type="dxa" w:w="60"/>
+              <w:right w:type="dxa" w:w="100"/>
+            </w:tcMar>
+          </w:tcPr>
+          <w:p>
+            <w:pPr>
+              <w:jc w:val="center"/>
+            </w:pPr>
+            <w:r>
+              <w:rPr>
+                <w:rFonts w:ascii="Calibri" w:cs="Calibri" w:eastAsia="Calibri" w:hAnsi="Calibri"/>
+                <w:b/>
+                <w:bCs/>
+                <w:color w:val="16A34A"/>
+                <w:sz w:val="14"/>
+                <w:szCs w:val="14"/>
+              </w:rPr>
+              <w:t xml:space="preserve">CONCLUIDO</w:t>
+            </w:r>
+          </w:p>
+        </w:tc>
+        <w:tc>
+          <w:tcPr>
+            <w:tcW w:type="dxa" w:w="5200"/>
+            <w:tcBorders>
+              <w:top w:val="single" w:color="D1D5DB" w:sz="1"/>
+              <w:left w:val="single" w:color="D1D5DB" w:sz="1"/>
+              <w:bottom w:val="single" w:color="D1D5DB" w:sz="1"/>
+              <w:right w:val="single" w:color="D1D5DB" w:sz="1"/>
+            </w:tcBorders>
+            <w:shd w:fill="F9FAFB" w:val="clear"/>
+            <w:tcMar>
+              <w:top w:type="dxa" w:w="60"/>
+              <w:left w:type="dxa" w:w="100"/>
+              <w:bottom w:type="dxa" w:w="60"/>
+              <w:right w:type="dxa" w:w="100"/>
+            </w:tcMar>
+          </w:tcPr>
+          <w:p>
+            <w:r>
+              <w:rPr>
+                <w:rFonts w:ascii="Calibri" w:cs="Calibri" w:eastAsia="Calibri" w:hAnsi="Calibri"/>
+                <w:color w:val="111827"/>
+                <w:sz w:val="18"/>
+                <w:szCs w:val="18"/>
+              </w:rPr>
+              <w:t xml:space="preserve">Cobranca anual implementada: toggle mensal/anual no onboarding e GlobalPaywallModal, flag billingCycle no Stripe, IDs de preco separados por ciclo (commit 47b5443)</w:t>
+            </w:r>
+          </w:p>
+        </w:tc>
+        <w:tc>
+          <w:tcPr>
+            <w:tcW w:type="dxa" w:w="1500"/>
+            <w:tcBorders>
+              <w:top w:val="single" w:color="D1D5DB" w:sz="1"/>
+              <w:left w:val="single" w:color="D1D5DB" w:sz="1"/>
+              <w:bottom w:val="single" w:color="D1D5DB" w:sz="1"/>
+              <w:right w:val="single" w:color="D1D5DB" w:sz="1"/>
+            </w:tcBorders>
+            <w:shd w:fill="F9FAFB" w:val="clear"/>
+            <w:tcMar>
+              <w:top w:type="dxa" w:w="60"/>
+              <w:left w:type="dxa" w:w="100"/>
+              <w:bottom w:type="dxa" w:w="60"/>
+              <w:right w:type="dxa" w:w="100"/>
+            </w:tcMar>
+          </w:tcPr>
+          <w:p>
+            <w:pPr>
+              <w:jc w:val="center"/>
+            </w:pPr>
+            <w:r>
+              <w:rPr>
+                <w:rFonts w:ascii="Calibri" w:cs="Calibri" w:eastAsia="Calibri" w:hAnsi="Calibri"/>
+                <w:color w:val="6B7280"/>
+                <w:sz w:val="17"/>
+                <w:szCs w:val="17"/>
+              </w:rPr>
+              <w:t xml:space="preserve">S3</w:t>
+            </w:r>
+          </w:p>
+        </w:tc>
+        <w:tc>
+          <w:tcPr>
+            <w:tcW w:type="dxa" w:w="2124"/>
+            <w:tcBorders>
+              <w:top w:val="single" w:color="D1D5DB" w:sz="1"/>
+              <w:left w:val="single" w:color="D1D5DB" w:sz="1"/>
+              <w:bottom w:val="single" w:color="D1D5DB" w:sz="1"/>
+              <w:right w:val="single" w:color="D1D5DB" w:sz="1"/>
+            </w:tcBorders>
+            <w:shd w:fill="F9FAFB" w:val="clear"/>
+            <w:tcMar>
+              <w:top w:type="dxa" w:w="60"/>
+              <w:left w:type="dxa" w:w="100"/>
+              <w:bottom w:type="dxa" w:w="60"/>
+              <w:right w:type="dxa" w:w="100"/>
+            </w:tcMar>
+          </w:tcPr>
+          <w:p>
+            <w:r>
+              <w:rPr>
+                <w:rFonts w:ascii="Calibri" w:cs="Calibri" w:eastAsia="Calibri" w:hAnsi="Calibri"/>
+                <w:color w:val="6B7280"/>
+                <w:sz w:val="17"/>
+                <w:szCs w:val="17"/>
+              </w:rPr>
+              <w:t xml:space="preserve">Gustavo/Dev</w:t>
             </w:r>
           </w:p>
         </w:tc>
@@ -10989,6 +11997,132 @@
               <w:right w:val="single" w:color="D1D5DB" w:sz="1"/>
             </w:tcBorders>
             <w:shd w:fill="FFFFFF" w:val="clear"/>
+            <w:tcMar>
+              <w:top w:type="dxa" w:w="60"/>
+              <w:left w:type="dxa" w:w="100"/>
+              <w:bottom w:type="dxa" w:w="60"/>
+              <w:right w:type="dxa" w:w="100"/>
+            </w:tcMar>
+          </w:tcPr>
+          <w:p>
+            <w:r>
+              <w:rPr>
+                <w:rFonts w:ascii="Calibri" w:cs="Calibri" w:eastAsia="Calibri" w:hAnsi="Calibri"/>
+                <w:color w:val="6B7280"/>
+                <w:sz w:val="17"/>
+                <w:szCs w:val="17"/>
+              </w:rPr>
+              <w:t xml:space="preserve">Gustavo/Dev</w:t>
+            </w:r>
+          </w:p>
+        </w:tc>
+      </w:tr>
+      <w:tr>
+        <w:tc>
+          <w:tcPr>
+            <w:tcW w:type="dxa" w:w="1400"/>
+            <w:tcBorders>
+              <w:top w:val="single" w:color="D1D5DB" w:sz="1"/>
+              <w:left w:val="single" w:color="D1D5DB" w:sz="1"/>
+              <w:bottom w:val="single" w:color="D1D5DB" w:sz="1"/>
+              <w:right w:val="single" w:color="D1D5DB" w:sz="1"/>
+            </w:tcBorders>
+            <w:shd w:fill="F9FAFB" w:val="clear"/>
+            <w:tcMar>
+              <w:top w:type="dxa" w:w="60"/>
+              <w:left w:type="dxa" w:w="100"/>
+              <w:bottom w:type="dxa" w:w="60"/>
+              <w:right w:type="dxa" w:w="100"/>
+            </w:tcMar>
+          </w:tcPr>
+          <w:p>
+            <w:pPr>
+              <w:jc w:val="center"/>
+            </w:pPr>
+            <w:r>
+              <w:rPr>
+                <w:rFonts w:ascii="Calibri" w:cs="Calibri" w:eastAsia="Calibri" w:hAnsi="Calibri"/>
+                <w:b/>
+                <w:bCs/>
+                <w:color w:val="16A34A"/>
+                <w:sz w:val="14"/>
+                <w:szCs w:val="14"/>
+              </w:rPr>
+              <w:t xml:space="preserve">CONCLUIDO</w:t>
+            </w:r>
+          </w:p>
+        </w:tc>
+        <w:tc>
+          <w:tcPr>
+            <w:tcW w:type="dxa" w:w="5200"/>
+            <w:tcBorders>
+              <w:top w:val="single" w:color="D1D5DB" w:sz="1"/>
+              <w:left w:val="single" w:color="D1D5DB" w:sz="1"/>
+              <w:bottom w:val="single" w:color="D1D5DB" w:sz="1"/>
+              <w:right w:val="single" w:color="D1D5DB" w:sz="1"/>
+            </w:tcBorders>
+            <w:shd w:fill="F9FAFB" w:val="clear"/>
+            <w:tcMar>
+              <w:top w:type="dxa" w:w="60"/>
+              <w:left w:type="dxa" w:w="100"/>
+              <w:bottom w:type="dxa" w:w="60"/>
+              <w:right w:type="dxa" w:w="100"/>
+            </w:tcMar>
+          </w:tcPr>
+          <w:p>
+            <w:r>
+              <w:rPr>
+                <w:rFonts w:ascii="Calibri" w:cs="Calibri" w:eastAsia="Calibri" w:hAnsi="Calibri"/>
+                <w:color w:val="111827"/>
+                <w:sz w:val="18"/>
+                <w:szCs w:val="18"/>
+              </w:rPr>
+              <w:t xml:space="preserve">Rota /lancamento/page.tsx criada no app — pagina de lancamento integrada ao Next.js (commit 3107496)</w:t>
+            </w:r>
+          </w:p>
+        </w:tc>
+        <w:tc>
+          <w:tcPr>
+            <w:tcW w:type="dxa" w:w="1500"/>
+            <w:tcBorders>
+              <w:top w:val="single" w:color="D1D5DB" w:sz="1"/>
+              <w:left w:val="single" w:color="D1D5DB" w:sz="1"/>
+              <w:bottom w:val="single" w:color="D1D5DB" w:sz="1"/>
+              <w:right w:val="single" w:color="D1D5DB" w:sz="1"/>
+            </w:tcBorders>
+            <w:shd w:fill="F9FAFB" w:val="clear"/>
+            <w:tcMar>
+              <w:top w:type="dxa" w:w="60"/>
+              <w:left w:type="dxa" w:w="100"/>
+              <w:bottom w:type="dxa" w:w="60"/>
+              <w:right w:type="dxa" w:w="100"/>
+            </w:tcMar>
+          </w:tcPr>
+          <w:p>
+            <w:pPr>
+              <w:jc w:val="center"/>
+            </w:pPr>
+            <w:r>
+              <w:rPr>
+                <w:rFonts w:ascii="Calibri" w:cs="Calibri" w:eastAsia="Calibri" w:hAnsi="Calibri"/>
+                <w:color w:val="6B7280"/>
+                <w:sz w:val="17"/>
+                <w:szCs w:val="17"/>
+              </w:rPr>
+              <w:t xml:space="preserve">S3</w:t>
+            </w:r>
+          </w:p>
+        </w:tc>
+        <w:tc>
+          <w:tcPr>
+            <w:tcW w:type="dxa" w:w="2124"/>
+            <w:tcBorders>
+              <w:top w:val="single" w:color="D1D5DB" w:sz="1"/>
+              <w:left w:val="single" w:color="D1D5DB" w:sz="1"/>
+              <w:bottom w:val="single" w:color="D1D5DB" w:sz="1"/>
+              <w:right w:val="single" w:color="D1D5DB" w:sz="1"/>
+            </w:tcBorders>
+            <w:shd w:fill="F9FAFB" w:val="clear"/>
             <w:tcMar>
               <w:top w:type="dxa" w:w="60"/>
               <w:left w:type="dxa" w:w="100"/>

</xml_diff>

<commit_message>
fix(ui): adjust Sob consulta heading wrap and remove spammy console logs
</commit_message>
<xml_diff>
--- a/docs/Relatorio Status 5.docx
+++ b/docs/Relatorio Status 5.docx
@@ -310,7 +310,7 @@
                 <w:sz w:val="52"/>
                 <w:szCs w:val="52"/>
               </w:rPr>
-              <w:t xml:space="preserve">38</w:t>
+              <w:t xml:space="preserve">39</w:t>
             </w:r>
           </w:p>
           <w:p>
@@ -359,7 +359,7 @@
                 <w:sz w:val="52"/>
                 <w:szCs w:val="52"/>
               </w:rPr>
-              <w:t xml:space="preserve">4</w:t>
+              <w:t xml:space="preserve">6</w:t>
             </w:r>
           </w:p>
           <w:p>
@@ -408,7 +408,7 @@
                 <w:sz w:val="52"/>
                 <w:szCs w:val="52"/>
               </w:rPr>
-              <w:t xml:space="preserve">11</w:t>
+              <w:t xml:space="preserve">8</w:t>
             </w:r>
           </w:p>
           <w:p>
@@ -3753,11 +3753,11 @@
                 <w:rFonts w:ascii="Calibri" w:cs="Calibri" w:eastAsia="Calibri" w:hAnsi="Calibri"/>
                 <w:b/>
                 <w:bCs/>
-                <w:color w:val="6B7280"/>
+                <w:color w:val="16A34A"/>
                 <w:sz w:val="14"/>
                 <w:szCs w:val="14"/>
               </w:rPr>
-              <w:t xml:space="preserve">PENDENTE</w:t>
+              <w:t xml:space="preserve">CONCLUIDO</w:t>
             </w:r>
           </w:p>
         </w:tc>
@@ -10265,11 +10265,11 @@
                 <w:rFonts w:ascii="Calibri" w:cs="Calibri" w:eastAsia="Calibri" w:hAnsi="Calibri"/>
                 <w:b/>
                 <w:bCs/>
-                <w:color w:val="6B7280"/>
+                <w:color w:val="2563EB"/>
                 <w:sz w:val="14"/>
                 <w:szCs w:val="14"/>
               </w:rPr>
-              <w:t xml:space="preserve">PENDENTE</w:t>
+              <w:t xml:space="preserve">EM ANDAMENTO</w:t>
             </w:r>
           </w:p>
         </w:tc>
@@ -10298,7 +10298,7 @@
                 <w:sz w:val="18"/>
                 <w:szCs w:val="18"/>
               </w:rPr>
-              <w:t xml:space="preserve">Validar fluxo completo de ponta a ponta: cadastro → onboarding → imovel → recomendacao → assinatura</w:t>
+              <w:t xml:space="preserve">Validar fluxo completo de ponta a ponta: cadastro → onboarding → imovel → recomendacao → assinatura — cadastro/onboarding/imovel validados, falta recomendacao e assinatura</w:t>
             </w:r>
           </w:p>
         </w:tc>
@@ -12349,11 +12349,11 @@
                 <w:rFonts w:ascii="Calibri" w:cs="Calibri" w:eastAsia="Calibri" w:hAnsi="Calibri"/>
                 <w:b/>
                 <w:bCs/>
-                <w:color w:val="6B7280"/>
+                <w:color w:val="2563EB"/>
                 <w:sz w:val="14"/>
                 <w:szCs w:val="14"/>
               </w:rPr>
-              <w:t xml:space="preserve">PENDENTE</w:t>
+              <w:t xml:space="preserve">EM ANDAMENTO</w:t>
             </w:r>
           </w:p>
         </w:tc>
@@ -12382,7 +12382,7 @@
                 <w:sz w:val="18"/>
                 <w:szCs w:val="18"/>
               </w:rPr>
-              <w:t xml:space="preserve">Criar conta Instagram @urbanai.oficial e LinkedIn Urban AI</w:t>
+              <w:t xml:space="preserve">Criar contas nas redes sociais — Instagram @urbanai.oficial ja criado, aguarda criacao de LinkedIn e Facebook</w:t>
             </w:r>
           </w:p>
         </w:tc>

</xml_diff>